<commit_message>
first commit on files
</commit_message>
<xml_diff>
--- a/Try new project.docx
+++ b/Try new project.docx
@@ -133,8 +133,30 @@
           <w:szCs w:val="23"/>
           <w:lang w:eastAsia="en-GB"/>
         </w:rPr>
-        <w:t>&lt;</w:t>
-      </w:r>
+        <w:t>&lt;html</w:t>
+      </w:r>
+      <w:r>
+        <w:rPr>
+          <w:rFonts w:ascii="Consolas" w:eastAsia="Times New Roman" w:hAnsi="Consolas" w:cs="Times New Roman"/>
+          <w:color w:val="800000"/>
+          <w:sz w:val="23"/>
+          <w:szCs w:val="23"/>
+          <w:lang w:eastAsia="en-GB"/>
+        </w:rPr>
+        <w:t xml:space="preserve"> </w:t>
+      </w:r>
+      <w:proofErr w:type="spellStart"/>
+      <w:r>
+        <w:rPr>
+          <w:rFonts w:ascii="Consolas" w:eastAsia="Times New Roman" w:hAnsi="Consolas" w:cs="Times New Roman"/>
+          <w:color w:val="800000"/>
+          <w:sz w:val="23"/>
+          <w:szCs w:val="23"/>
+          <w:lang w:eastAsia="en-GB"/>
+        </w:rPr>
+        <w:t>lang</w:t>
+      </w:r>
+      <w:proofErr w:type="spellEnd"/>
       <w:proofErr w:type="gramStart"/>
       <w:r>
         <w:rPr>
@@ -144,9 +166,19 @@
           <w:szCs w:val="23"/>
           <w:lang w:eastAsia="en-GB"/>
         </w:rPr>
-        <w:t>html</w:t>
+        <w:t>= ”</w:t>
       </w:r>
       <w:proofErr w:type="gramEnd"/>
+      <w:r>
+        <w:rPr>
+          <w:rFonts w:ascii="Consolas" w:eastAsia="Times New Roman" w:hAnsi="Consolas" w:cs="Times New Roman"/>
+          <w:color w:val="800000"/>
+          <w:sz w:val="23"/>
+          <w:szCs w:val="23"/>
+          <w:lang w:eastAsia="en-GB"/>
+        </w:rPr>
+        <w:t>en”</w:t>
+      </w:r>
       <w:r>
         <w:rPr>
           <w:rFonts w:ascii="Consolas" w:eastAsia="Times New Roman" w:hAnsi="Consolas" w:cs="Times New Roman"/>
@@ -3188,19 +3220,7 @@
           <w:szCs w:val="23"/>
           <w:lang w:eastAsia="en-GB"/>
         </w:rPr>
-        <w:t>;</w:t>
-      </w:r>
-      <w:bookmarkStart w:id="0" w:name="_GoBack"/>
-      <w:bookmarkEnd w:id="0"/>
-      <w:r>
-        <w:rPr>
-          <w:rFonts w:ascii="Consolas" w:eastAsia="Times New Roman" w:hAnsi="Consolas" w:cs="Times New Roman"/>
-          <w:color w:val="3B3B3B"/>
-          <w:sz w:val="23"/>
-          <w:szCs w:val="23"/>
-          <w:lang w:eastAsia="en-GB"/>
-        </w:rPr>
-        <w:t xml:space="preserve">  </w:t>
+        <w:t>;  </w:t>
       </w:r>
     </w:p>
     <w:p>
@@ -4712,6 +4732,8 @@
           <w:szCs w:val="24"/>
         </w:rPr>
       </w:pPr>
+      <w:bookmarkStart w:id="0" w:name="_GoBack"/>
+      <w:bookmarkEnd w:id="0"/>
     </w:p>
     <w:sectPr>
       <w:pgSz w:w="11906" w:h="16838"/>

</xml_diff>